<commit_message>
Add video walkthrough link and key-code appendix to the report
The report now ends with the two most important pieces of code
(HybridModel.fit/predict and time_backtest), copied from the source
when the report is built.
</commit_message>
<xml_diff>
--- a/reports/freight_rate_report.docx
+++ b/reports/freight_rate_report.docx
@@ -3763,7 +3763,7 @@
         <w:pStyle w:val="Heading1"/>
       </w:pPr>
       <w:r>
-        <w:t>Appendix: reproducing the results</w:t>
+        <w:t>Appendix A: reproducing the results</w:t>
       </w:r>
     </w:p>
     <w:p>
@@ -3856,6 +3856,656 @@
         </w:rPr>
         <w:t>python make_report.py</w:t>
       </w:r>
+    </w:p>
+    <w:p>
+      <w:r>
+        <w:br w:type="page"/>
+      </w:r>
+    </w:p>
+    <w:p>
+      <w:pPr>
+        <w:pStyle w:val="Heading1"/>
+      </w:pPr>
+      <w:r>
+        <w:t>Appendix B: key code</w:t>
+      </w:r>
+    </w:p>
+    <w:p>
+      <w:r>
+        <w:rPr>
+          <w:b w:val="0"/>
+          <w:i w:val="0"/>
+        </w:rPr>
+        <w:t>The two most important pieces of code, copied from the repository each time this report is built.</w:t>
+      </w:r>
+    </w:p>
+    <w:p>
+      <w:pPr>
+        <w:keepNext/>
+      </w:pPr>
+      <w:r>
+        <w:rPr>
+          <w:i/>
+          <w:color w:val="52514E"/>
+          <w:sz w:val="18"/>
+        </w:rPr>
+        <w:t>Code 1. HybridModel.fit and HybridModel.predict (src/models.py, lines 143–162): trend stage, LightGBM on what is left, then the lane correction.</w:t>
+      </w:r>
+    </w:p>
+    <w:tbl>
+      <w:tblPr>
+        <w:tblW w:type="auto" w:w="0"/>
+        <w:jc w:val="center"/>
+        <w:tblLayout w:type="fixed"/>
+        <w:tblLook w:firstColumn="1" w:firstRow="1" w:lastColumn="0" w:lastRow="0" w:noHBand="0" w:noVBand="1" w:val="04A0"/>
+      </w:tblPr>
+      <w:tblGrid>
+        <w:gridCol w:w="9360"/>
+      </w:tblGrid>
+      <w:tr>
+        <w:tc>
+          <w:tcPr>
+            <w:tcW w:type="dxa" w:w="9360"/>
+            <w:shd w:val="clear" w:color="auto" w:fill="F3F4F4"/>
+          </w:tcPr>
+          <w:p>
+            <w:pPr>
+              <w:spacing w:after="0" w:line="240" w:lineRule="auto"/>
+            </w:pPr>
+            <w:r>
+              <w:rPr>
+                <w:rFonts w:ascii="Consolas" w:hAnsi="Consolas"/>
+                <w:sz w:val="18"/>
+              </w:rPr>
+              <w:t>def fit(self, df: pd.DataFrame):</w:t>
+            </w:r>
+          </w:p>
+          <w:p>
+            <w:pPr>
+              <w:spacing w:after="0" w:line="240" w:lineRule="auto"/>
+            </w:pPr>
+            <w:r>
+              <w:rPr>
+                <w:rFonts w:ascii="Consolas" w:hAnsi="Consolas"/>
+                <w:sz w:val="18"/>
+              </w:rPr>
+              <w:t xml:space="preserve">    self.trend = ParametricModel().fit(df)</w:t>
+            </w:r>
+          </w:p>
+          <w:p>
+            <w:pPr>
+              <w:spacing w:after="0" w:line="240" w:lineRule="auto"/>
+            </w:pPr>
+            <w:r>
+              <w:rPr>
+                <w:rFonts w:ascii="Consolas" w:hAnsi="Consolas"/>
+                <w:sz w:val="18"/>
+              </w:rPr>
+              <w:t xml:space="preserve">    resid = np.log(df[TARGET]) - self.trend.predict_log(df)</w:t>
+            </w:r>
+          </w:p>
+          <w:p>
+            <w:pPr>
+              <w:spacing w:after="0" w:line="240" w:lineRule="auto"/>
+            </w:pPr>
+            <w:r>
+              <w:rPr>
+                <w:rFonts w:ascii="Consolas" w:hAnsi="Consolas"/>
+                <w:sz w:val="18"/>
+              </w:rPr>
+              <w:t xml:space="preserve">    X = df[GBM_FEATURES]</w:t>
+            </w:r>
+          </w:p>
+          <w:p>
+            <w:pPr>
+              <w:spacing w:after="0" w:line="240" w:lineRule="auto"/>
+            </w:pPr>
+            <w:r>
+              <w:rPr>
+                <w:rFonts w:ascii="Consolas" w:hAnsi="Consolas"/>
+                <w:sz w:val="18"/>
+              </w:rPr>
+              <w:t xml:space="preserve">    self.gbm = self._gbm(X, resid)</w:t>
+            </w:r>
+          </w:p>
+          <w:p>
+            <w:pPr>
+              <w:spacing w:after="0" w:line="240" w:lineRule="auto"/>
+            </w:pPr>
+            <w:r>
+              <w:rPr>
+                <w:rFonts w:ascii="Consolas" w:hAnsi="Consolas"/>
+                <w:sz w:val="18"/>
+              </w:rPr>
+              <w:t xml:space="preserve">    if self.lane_correction:</w:t>
+            </w:r>
+          </w:p>
+          <w:p>
+            <w:pPr>
+              <w:spacing w:after="0" w:line="240" w:lineRule="auto"/>
+            </w:pPr>
+            <w:r>
+              <w:rPr>
+                <w:rFonts w:ascii="Consolas" w:hAnsi="Consolas"/>
+                <w:color w:val="52514E"/>
+                <w:sz w:val="18"/>
+              </w:rPr>
+              <w:t xml:space="preserve">        # Out-of-fold stage-2 predictions: in-sample residuals would already</w:t>
+            </w:r>
+          </w:p>
+          <w:p>
+            <w:pPr>
+              <w:spacing w:after="0" w:line="240" w:lineRule="auto"/>
+            </w:pPr>
+            <w:r>
+              <w:rPr>
+                <w:rFonts w:ascii="Consolas" w:hAnsi="Consolas"/>
+                <w:color w:val="52514E"/>
+                <w:sz w:val="18"/>
+              </w:rPr>
+              <w:t xml:space="preserve">        # be partly fitted by the trees and understate lane effects.</w:t>
+            </w:r>
+          </w:p>
+          <w:p>
+            <w:pPr>
+              <w:spacing w:after="0" w:line="240" w:lineRule="auto"/>
+            </w:pPr>
+            <w:r>
+              <w:rPr>
+                <w:rFonts w:ascii="Consolas" w:hAnsi="Consolas"/>
+                <w:sz w:val="18"/>
+              </w:rPr>
+              <w:t xml:space="preserve">        oof = np.zeros(len(df))</w:t>
+            </w:r>
+          </w:p>
+          <w:p>
+            <w:pPr>
+              <w:spacing w:after="0" w:line="240" w:lineRule="auto"/>
+            </w:pPr>
+            <w:r>
+              <w:rPr>
+                <w:rFonts w:ascii="Consolas" w:hAnsi="Consolas"/>
+                <w:sz w:val="18"/>
+              </w:rPr>
+              <w:t xml:space="preserve">        for fit_idx, pred_idx in KFold(5, shuffle=True, random_state=SEED).split(df):</w:t>
+            </w:r>
+          </w:p>
+          <w:p>
+            <w:pPr>
+              <w:spacing w:after="0" w:line="240" w:lineRule="auto"/>
+            </w:pPr>
+            <w:r>
+              <w:rPr>
+                <w:rFonts w:ascii="Consolas" w:hAnsi="Consolas"/>
+                <w:sz w:val="18"/>
+              </w:rPr>
+              <w:t xml:space="preserve">            fold_model = self._gbm(X.iloc[fit_idx], resid.iloc[fit_idx])</w:t>
+            </w:r>
+          </w:p>
+          <w:p>
+            <w:pPr>
+              <w:spacing w:after="0" w:line="240" w:lineRule="auto"/>
+            </w:pPr>
+            <w:r>
+              <w:rPr>
+                <w:rFonts w:ascii="Consolas" w:hAnsi="Consolas"/>
+                <w:sz w:val="18"/>
+              </w:rPr>
+              <w:t xml:space="preserve">            oof[pred_idx] = fold_model.predict(X.iloc[pred_idx])</w:t>
+            </w:r>
+          </w:p>
+          <w:p>
+            <w:pPr>
+              <w:spacing w:after="0" w:line="240" w:lineRule="auto"/>
+            </w:pPr>
+            <w:r>
+              <w:rPr>
+                <w:rFonts w:ascii="Consolas" w:hAnsi="Consolas"/>
+                <w:sz w:val="18"/>
+              </w:rPr>
+              <w:t xml:space="preserve">        self.lanes = LaneCorrection().fit(df, resid - oof)</w:t>
+            </w:r>
+          </w:p>
+          <w:p>
+            <w:pPr>
+              <w:spacing w:after="0" w:line="240" w:lineRule="auto"/>
+            </w:pPr>
+            <w:r>
+              <w:rPr>
+                <w:rFonts w:ascii="Consolas" w:hAnsi="Consolas"/>
+                <w:sz w:val="18"/>
+              </w:rPr>
+              <w:t xml:space="preserve">    return self</w:t>
+            </w:r>
+          </w:p>
+          <w:p>
+            <w:pPr>
+              <w:spacing w:after="0" w:line="240" w:lineRule="auto"/>
+            </w:pPr>
+            <w:r>
+              <w:rPr>
+                <w:rFonts w:ascii="Consolas" w:hAnsi="Consolas"/>
+                <w:sz w:val="18"/>
+              </w:rPr>
+              <w:t xml:space="preserve"> </w:t>
+            </w:r>
+          </w:p>
+          <w:p>
+            <w:pPr>
+              <w:spacing w:after="0" w:line="240" w:lineRule="auto"/>
+            </w:pPr>
+            <w:r>
+              <w:rPr>
+                <w:rFonts w:ascii="Consolas" w:hAnsi="Consolas"/>
+                <w:sz w:val="18"/>
+              </w:rPr>
+              <w:t>def predict(self, df: pd.DataFrame) -&gt; np.ndarray:</w:t>
+            </w:r>
+          </w:p>
+          <w:p>
+            <w:pPr>
+              <w:spacing w:after="0" w:line="240" w:lineRule="auto"/>
+            </w:pPr>
+            <w:r>
+              <w:rPr>
+                <w:rFonts w:ascii="Consolas" w:hAnsi="Consolas"/>
+                <w:sz w:val="18"/>
+              </w:rPr>
+              <w:t xml:space="preserve">    log_rate = self.trend.predict_log(df) + self.gbm.predict(df[GBM_FEATURES])</w:t>
+            </w:r>
+          </w:p>
+          <w:p>
+            <w:pPr>
+              <w:spacing w:after="0" w:line="240" w:lineRule="auto"/>
+            </w:pPr>
+            <w:r>
+              <w:rPr>
+                <w:rFonts w:ascii="Consolas" w:hAnsi="Consolas"/>
+                <w:sz w:val="18"/>
+              </w:rPr>
+              <w:t xml:space="preserve">    if self.lane_correction:</w:t>
+            </w:r>
+          </w:p>
+          <w:p>
+            <w:pPr>
+              <w:spacing w:after="0" w:line="240" w:lineRule="auto"/>
+            </w:pPr>
+            <w:r>
+              <w:rPr>
+                <w:rFonts w:ascii="Consolas" w:hAnsi="Consolas"/>
+                <w:sz w:val="18"/>
+              </w:rPr>
+              <w:t xml:space="preserve">        log_rate = log_rate + self.lanes.transform(df)</w:t>
+            </w:r>
+          </w:p>
+          <w:p>
+            <w:pPr>
+              <w:spacing w:after="0" w:line="240" w:lineRule="auto"/>
+            </w:pPr>
+            <w:r>
+              <w:rPr>
+                <w:rFonts w:ascii="Consolas" w:hAnsi="Consolas"/>
+                <w:sz w:val="18"/>
+              </w:rPr>
+              <w:t xml:space="preserve">    return np.exp(log_rate)</w:t>
+            </w:r>
+          </w:p>
+        </w:tc>
+      </w:tr>
+    </w:tbl>
+    <w:p>
+      <w:pPr>
+        <w:spacing w:after="40"/>
+      </w:pPr>
+    </w:p>
+    <w:p>
+      <w:pPr>
+        <w:keepNext/>
+      </w:pPr>
+      <w:r>
+        <w:rPr>
+          <w:i/>
+          <w:color w:val="52514E"/>
+          <w:sz w:val="18"/>
+        </w:rPr>
+        <w:t>Code 2. time_backtest (src/validation.py, lines 24–49): the date-based, expanding-window split.</w:t>
+      </w:r>
+    </w:p>
+    <w:tbl>
+      <w:tblPr>
+        <w:tblW w:type="auto" w:w="0"/>
+        <w:jc w:val="center"/>
+        <w:tblLayout w:type="fixed"/>
+        <w:tblLook w:firstColumn="1" w:firstRow="1" w:lastColumn="0" w:lastRow="0" w:noHBand="0" w:noVBand="1" w:val="04A0"/>
+      </w:tblPr>
+      <w:tblGrid>
+        <w:gridCol w:w="9360"/>
+      </w:tblGrid>
+      <w:tr>
+        <w:tc>
+          <w:tcPr>
+            <w:tcW w:type="dxa" w:w="9360"/>
+            <w:shd w:val="clear" w:color="auto" w:fill="F3F4F4"/>
+          </w:tcPr>
+          <w:p>
+            <w:pPr>
+              <w:spacing w:after="0" w:line="240" w:lineRule="auto"/>
+            </w:pPr>
+            <w:r>
+              <w:rPr>
+                <w:rFonts w:ascii="Consolas" w:hAnsi="Consolas"/>
+                <w:sz w:val="18"/>
+              </w:rPr>
+              <w:t>def time_backtest(df: pd.DataFrame, make_model, outlier_mask: pd.Series) -&gt; list[dict]:</w:t>
+            </w:r>
+          </w:p>
+          <w:p>
+            <w:pPr>
+              <w:spacing w:after="0" w:line="240" w:lineRule="auto"/>
+            </w:pPr>
+            <w:r>
+              <w:rPr>
+                <w:rFonts w:ascii="Consolas" w:hAnsi="Consolas"/>
+                <w:sz w:val="18"/>
+              </w:rPr>
+              <w:t xml:space="preserve">    """Expanding-window backtest.</w:t>
+            </w:r>
+          </w:p>
+          <w:p>
+            <w:pPr>
+              <w:spacing w:after="0" w:line="240" w:lineRule="auto"/>
+            </w:pPr>
+            <w:r>
+              <w:rPr>
+                <w:rFonts w:ascii="Consolas" w:hAnsi="Consolas"/>
+                <w:sz w:val="18"/>
+              </w:rPr>
+              <w:t xml:space="preserve"> </w:t>
+            </w:r>
+          </w:p>
+          <w:p>
+            <w:pPr>
+              <w:spacing w:after="0" w:line="240" w:lineRule="auto"/>
+            </w:pPr>
+            <w:r>
+              <w:rPr>
+                <w:rFonts w:ascii="Consolas" w:hAnsi="Consolas"/>
+                <w:sz w:val="18"/>
+              </w:rPr>
+              <w:t xml:space="preserve">    Training rows are filtered for label outliers using a mask computed on the</w:t>
+            </w:r>
+          </w:p>
+          <w:p>
+            <w:pPr>
+              <w:spacing w:after="0" w:line="240" w:lineRule="auto"/>
+            </w:pPr>
+            <w:r>
+              <w:rPr>
+                <w:rFonts w:ascii="Consolas" w:hAnsi="Consolas"/>
+                <w:sz w:val="18"/>
+              </w:rPr>
+              <w:t xml:space="preserve">    training window only; test rows are always scored in full ("all") and</w:t>
+            </w:r>
+          </w:p>
+          <w:p>
+            <w:pPr>
+              <w:spacing w:after="0" w:line="240" w:lineRule="auto"/>
+            </w:pPr>
+            <w:r>
+              <w:rPr>
+                <w:rFonts w:ascii="Consolas" w:hAnsi="Consolas"/>
+                <w:sz w:val="18"/>
+              </w:rPr>
+              <w:t xml:space="preserve">    separately with outliers removed ("clean") for a noise-free read.</w:t>
+            </w:r>
+          </w:p>
+          <w:p>
+            <w:pPr>
+              <w:spacing w:after="0" w:line="240" w:lineRule="auto"/>
+            </w:pPr>
+            <w:r>
+              <w:rPr>
+                <w:rFonts w:ascii="Consolas" w:hAnsi="Consolas"/>
+                <w:sz w:val="18"/>
+              </w:rPr>
+              <w:t xml:space="preserve">    """</w:t>
+            </w:r>
+          </w:p>
+          <w:p>
+            <w:pPr>
+              <w:spacing w:after="0" w:line="240" w:lineRule="auto"/>
+            </w:pPr>
+            <w:r>
+              <w:rPr>
+                <w:rFonts w:ascii="Consolas" w:hAnsi="Consolas"/>
+                <w:sz w:val="18"/>
+              </w:rPr>
+              <w:t xml:space="preserve">    results = []</w:t>
+            </w:r>
+          </w:p>
+          <w:p>
+            <w:pPr>
+              <w:spacing w:after="0" w:line="240" w:lineRule="auto"/>
+            </w:pPr>
+            <w:r>
+              <w:rPr>
+                <w:rFonts w:ascii="Consolas" w:hAnsi="Consolas"/>
+                <w:sz w:val="18"/>
+              </w:rPr>
+              <w:t xml:space="preserve">    for train_end, test_start, test_end in BACKTEST_FOLDS:</w:t>
+            </w:r>
+          </w:p>
+          <w:p>
+            <w:pPr>
+              <w:spacing w:after="0" w:line="240" w:lineRule="auto"/>
+            </w:pPr>
+            <w:r>
+              <w:rPr>
+                <w:rFonts w:ascii="Consolas" w:hAnsi="Consolas"/>
+                <w:sz w:val="18"/>
+              </w:rPr>
+              <w:t xml:space="preserve">        train = df[df["date"] &lt;= train_end]</w:t>
+            </w:r>
+          </w:p>
+          <w:p>
+            <w:pPr>
+              <w:spacing w:after="0" w:line="240" w:lineRule="auto"/>
+            </w:pPr>
+            <w:r>
+              <w:rPr>
+                <w:rFonts w:ascii="Consolas" w:hAnsi="Consolas"/>
+                <w:sz w:val="18"/>
+              </w:rPr>
+              <w:t xml:space="preserve">        test = df[(df["date"] &gt;= test_start) &amp; (df["date"] &lt;= test_end)]</w:t>
+            </w:r>
+          </w:p>
+          <w:p>
+            <w:pPr>
+              <w:spacing w:after="0" w:line="240" w:lineRule="auto"/>
+            </w:pPr>
+            <w:r>
+              <w:rPr>
+                <w:rFonts w:ascii="Consolas" w:hAnsi="Consolas"/>
+                <w:sz w:val="18"/>
+              </w:rPr>
+              <w:t xml:space="preserve">        train = train[~flag_label_outliers(train)]</w:t>
+            </w:r>
+          </w:p>
+          <w:p>
+            <w:pPr>
+              <w:spacing w:after="0" w:line="240" w:lineRule="auto"/>
+            </w:pPr>
+            <w:r>
+              <w:rPr>
+                <w:rFonts w:ascii="Consolas" w:hAnsi="Consolas"/>
+                <w:sz w:val="18"/>
+              </w:rPr>
+              <w:t xml:space="preserve">        model = make_model().fit(train)</w:t>
+            </w:r>
+          </w:p>
+          <w:p>
+            <w:pPr>
+              <w:spacing w:after="0" w:line="240" w:lineRule="auto"/>
+            </w:pPr>
+            <w:r>
+              <w:rPr>
+                <w:rFonts w:ascii="Consolas" w:hAnsi="Consolas"/>
+                <w:sz w:val="18"/>
+              </w:rPr>
+              <w:t xml:space="preserve">        pred = model.predict(test)</w:t>
+            </w:r>
+          </w:p>
+          <w:p>
+            <w:pPr>
+              <w:spacing w:after="0" w:line="240" w:lineRule="auto"/>
+            </w:pPr>
+            <w:r>
+              <w:rPr>
+                <w:rFonts w:ascii="Consolas" w:hAnsi="Consolas"/>
+                <w:sz w:val="18"/>
+              </w:rPr>
+              <w:t xml:space="preserve">        clean = ~outlier_mask.loc[test.index]</w:t>
+            </w:r>
+          </w:p>
+          <w:p>
+            <w:pPr>
+              <w:spacing w:after="0" w:line="240" w:lineRule="auto"/>
+            </w:pPr>
+            <w:r>
+              <w:rPr>
+                <w:rFonts w:ascii="Consolas" w:hAnsi="Consolas"/>
+                <w:sz w:val="18"/>
+              </w:rPr>
+              <w:t xml:space="preserve">        results.append(</w:t>
+            </w:r>
+          </w:p>
+          <w:p>
+            <w:pPr>
+              <w:spacing w:after="0" w:line="240" w:lineRule="auto"/>
+            </w:pPr>
+            <w:r>
+              <w:rPr>
+                <w:rFonts w:ascii="Consolas" w:hAnsi="Consolas"/>
+                <w:sz w:val="18"/>
+              </w:rPr>
+              <w:t xml:space="preserve">            {</w:t>
+            </w:r>
+          </w:p>
+          <w:p>
+            <w:pPr>
+              <w:spacing w:after="0" w:line="240" w:lineRule="auto"/>
+            </w:pPr>
+            <w:r>
+              <w:rPr>
+                <w:rFonts w:ascii="Consolas" w:hAnsi="Consolas"/>
+                <w:sz w:val="18"/>
+              </w:rPr>
+              <w:t xml:space="preserve">                "fold": f"train&lt;= {train_end} | test {test_start}..{test_end}",</w:t>
+            </w:r>
+          </w:p>
+          <w:p>
+            <w:pPr>
+              <w:spacing w:after="0" w:line="240" w:lineRule="auto"/>
+            </w:pPr>
+            <w:r>
+              <w:rPr>
+                <w:rFonts w:ascii="Consolas" w:hAnsi="Consolas"/>
+                <w:sz w:val="18"/>
+              </w:rPr>
+              <w:t xml:space="preserve">                "n_train": len(train),</w:t>
+            </w:r>
+          </w:p>
+          <w:p>
+            <w:pPr>
+              <w:spacing w:after="0" w:line="240" w:lineRule="auto"/>
+            </w:pPr>
+            <w:r>
+              <w:rPr>
+                <w:rFonts w:ascii="Consolas" w:hAnsi="Consolas"/>
+                <w:sz w:val="18"/>
+              </w:rPr>
+              <w:t xml:space="preserve">                "n_test": len(test),</w:t>
+            </w:r>
+          </w:p>
+          <w:p>
+            <w:pPr>
+              <w:spacing w:after="0" w:line="240" w:lineRule="auto"/>
+            </w:pPr>
+            <w:r>
+              <w:rPr>
+                <w:rFonts w:ascii="Consolas" w:hAnsi="Consolas"/>
+                <w:sz w:val="18"/>
+              </w:rPr>
+              <w:t xml:space="preserve">                "all": metrics(test[TARGET], pred),</w:t>
+            </w:r>
+          </w:p>
+          <w:p>
+            <w:pPr>
+              <w:spacing w:after="0" w:line="240" w:lineRule="auto"/>
+            </w:pPr>
+            <w:r>
+              <w:rPr>
+                <w:rFonts w:ascii="Consolas" w:hAnsi="Consolas"/>
+                <w:sz w:val="18"/>
+              </w:rPr>
+              <w:t xml:space="preserve">                "clean": metrics(test.loc[clean, TARGET], pred[clean.to_numpy()]),</w:t>
+            </w:r>
+          </w:p>
+          <w:p>
+            <w:pPr>
+              <w:spacing w:after="0" w:line="240" w:lineRule="auto"/>
+            </w:pPr>
+            <w:r>
+              <w:rPr>
+                <w:rFonts w:ascii="Consolas" w:hAnsi="Consolas"/>
+                <w:sz w:val="18"/>
+              </w:rPr>
+              <w:t xml:space="preserve">                "pred": pd.Series(pred, index=test.index),</w:t>
+            </w:r>
+          </w:p>
+          <w:p>
+            <w:pPr>
+              <w:spacing w:after="0" w:line="240" w:lineRule="auto"/>
+            </w:pPr>
+            <w:r>
+              <w:rPr>
+                <w:rFonts w:ascii="Consolas" w:hAnsi="Consolas"/>
+                <w:sz w:val="18"/>
+              </w:rPr>
+              <w:t xml:space="preserve">            }</w:t>
+            </w:r>
+          </w:p>
+          <w:p>
+            <w:pPr>
+              <w:spacing w:after="0" w:line="240" w:lineRule="auto"/>
+            </w:pPr>
+            <w:r>
+              <w:rPr>
+                <w:rFonts w:ascii="Consolas" w:hAnsi="Consolas"/>
+                <w:sz w:val="18"/>
+              </w:rPr>
+              <w:t xml:space="preserve">        )</w:t>
+            </w:r>
+          </w:p>
+          <w:p>
+            <w:pPr>
+              <w:spacing w:after="0" w:line="240" w:lineRule="auto"/>
+            </w:pPr>
+            <w:r>
+              <w:rPr>
+                <w:rFonts w:ascii="Consolas" w:hAnsi="Consolas"/>
+                <w:sz w:val="18"/>
+              </w:rPr>
+              <w:t xml:space="preserve">    return results</w:t>
+            </w:r>
+          </w:p>
+        </w:tc>
+      </w:tr>
+    </w:tbl>
+    <w:p>
+      <w:pPr>
+        <w:spacing w:after="40"/>
+      </w:pPr>
     </w:p>
     <w:sectPr>
       <w:pgSz w:w="12240" w:h="15840"/>

</xml_diff>